<commit_message>
doing some diploma work
</commit_message>
<xml_diff>
--- a/41IA Intelektualnyj analiz danyh/4/IA_KNT-122_Onyshchenko_19_PR4.docx
+++ b/41IA Intelektualnyj analiz danyh/4/IA_KNT-122_Onyshchenko_19_PR4.docx
@@ -756,17 +756,7 @@
           <w:smallCaps w:val="false"/>
           <w:spacing w:val="0"/>
         </w:rPr>
-        <w:t>- порівняти отримані моделі регресії за допомогою модуля Experimenter.</w:t>
-      </w:r>
-      <w:r>
-        <w:rPr>
-          <w:b w:val="false"/>
-          <w:i w:val="false"/>
-          <w:caps w:val="false"/>
-          <w:smallCaps w:val="false"/>
-          <w:spacing w:val="0"/>
-        </w:rPr>
-        <w:t xml:space="preserve"> </w:t>
+        <w:t xml:space="preserve">- порівняти отримані моделі регресії за допомогою модуля Experimenter. </w:t>
       </w:r>
     </w:p>
     <w:p>
@@ -3204,13 +3194,13 @@
       <w:lang w:val="en-US" w:eastAsia="uk-UA"/>
     </w:rPr>
   </w:style>
+  <w:style w:type="character" w:styleId="Style12">
+    <w:name w:val="Символ нумерації"/>
+    <w:qFormat/>
+    <w:rPr/>
+  </w:style>
   <w:style w:type="character" w:styleId="user">
-    <w:name w:val="Символ нумерації (user)"/>
-    <w:qFormat/>
-    <w:rPr/>
-  </w:style>
-  <w:style w:type="character" w:styleId="Style12">
-    <w:name w:val="Маркери"/>
+    <w:name w:val="Маркери (user)"/>
     <w:qFormat/>
     <w:rPr>
       <w:rFonts w:ascii="OpenSymbol" w:hAnsi="OpenSymbol" w:eastAsia="OpenSymbol" w:cs="OpenSymbol"/>
@@ -3233,7 +3223,7 @@
       <w:spacing w:before="240" w:after="120"/>
     </w:pPr>
     <w:rPr>
-      <w:rFonts w:ascii="Liberation Sans" w:hAnsi="Liberation Sans" w:eastAsia="Microsoft YaHei" w:cs="Arial Unicode MS"/>
+      <w:rFonts w:ascii="Liberation Sans" w:hAnsi="Liberation Sans" w:eastAsia="Microsoft YaHei" w:cs="Lucida Sans"/>
       <w:sz w:val="28"/>
       <w:szCs w:val="28"/>
     </w:rPr>
@@ -3278,7 +3268,7 @@
       <w:suppressLineNumbers/>
     </w:pPr>
     <w:rPr>
-      <w:rFonts w:cs="Arial Unicode MS"/>
+      <w:rFonts w:cs="Lucida Sans"/>
     </w:rPr>
   </w:style>
   <w:style w:type="paragraph" w:styleId="user1">
@@ -3291,7 +3281,7 @@
       <w:spacing w:before="240" w:after="120"/>
     </w:pPr>
     <w:rPr>
-      <w:rFonts w:ascii="Liberation Sans" w:hAnsi="Liberation Sans" w:eastAsia="Microsoft YaHei" w:cs="Lucida Sans"/>
+      <w:rFonts w:ascii="Liberation Sans" w:hAnsi="Liberation Sans" w:eastAsia="Microsoft YaHei" w:cs="Arial Unicode MS"/>
       <w:sz w:val="28"/>
       <w:szCs w:val="28"/>
     </w:rPr>
@@ -3304,12 +3294,12 @@
       <w:suppressLineNumbers/>
     </w:pPr>
     <w:rPr>
-      <w:rFonts w:cs="Lucida Sans"/>
+      <w:rFonts w:cs="Arial Unicode MS"/>
     </w:rPr>
   </w:style>
   <w:style w:type="paragraph" w:styleId="IndexHeading">
     <w:name w:val="index heading"/>
-    <w:basedOn w:val="Style13"/>
+    <w:basedOn w:val="user1"/>
     <w:pPr/>
     <w:rPr/>
   </w:style>
@@ -3614,8 +3604,8 @@
     </w:pPr>
     <w:rPr/>
   </w:style>
-  <w:style w:type="numbering" w:styleId="Style15" w:default="1">
-    <w:name w:val="Без маркерів"/>
+  <w:style w:type="numbering" w:styleId="user3" w:default="1">
+    <w:name w:val="Без маркерів (user)"/>
     <w:uiPriority w:val="99"/>
     <w:semiHidden/>
     <w:unhideWhenUsed/>

</xml_diff>